<commit_message>
Actualizacion manual usuario testing y zip
comprimido de la aplicacion web
</commit_message>
<xml_diff>
--- a/e3_rosales_franco_s8_manualusuariotesting.docx
+++ b/e3_rosales_franco_s8_manualusuariotesting.docx
@@ -227,7 +227,7 @@
               </wp:anchor>
             </w:drawing>
           </mc:Choice>
-          <mc:Fallback xmlns:a="http://schemas.openxmlformats.org/drawingml/2006/main" xmlns:adec="http://schemas.microsoft.com/office/drawing/2017/decorative" xmlns:pic="http://schemas.openxmlformats.org/drawingml/2006/picture" xmlns:a14="http://schemas.microsoft.com/office/drawing/2010/main">
+          <mc:Fallback xmlns:a14="http://schemas.microsoft.com/office/drawing/2010/main" xmlns:pic="http://schemas.openxmlformats.org/drawingml/2006/picture" xmlns:adec="http://schemas.microsoft.com/office/drawing/2017/decorative" xmlns:a="http://schemas.openxmlformats.org/drawingml/2006/main">
             <w:pict>
               <v:rect id="Rectángulo 5" style="position:absolute;margin-left:0;margin-top:17.45pt;width:217.5pt;height:42pt;z-index:-251661315;visibility:visible;mso-wrap-style:square;mso-width-percent:0;mso-wrap-distance-left:9pt;mso-wrap-distance-top:0;mso-wrap-distance-right:9pt;mso-wrap-distance-bottom:0;mso-position-horizontal:absolute;mso-position-horizontal-relative:page;mso-position-vertical:absolute;mso-position-vertical-relative:text;mso-width-percent:0;mso-width-relative:margin;v-text-anchor:middle" alt="&quot;&quot;" o:spid="_x0000_s1026" fillcolor="#ffc600" stroked="f" strokeweight="1pt" w14:anchorId="0965D0A1" o:gfxdata="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">
                 <w10:wrap anchorx="page"/>
@@ -1048,7 +1048,25 @@
       </w:hyperlink>
     </w:p>
     <w:p/>
-    <w:p/>
+    <w:p>
+      <w:r>
+        <w:t>Drive del proyecto:</w:t>
+      </w:r>
+      <w:r>
+        <w:br/>
+      </w:r>
+      <w:r>
+        <w:br/>
+      </w:r>
+      <w:hyperlink r:id="rId19" w:history="1">
+        <w:r>
+          <w:rPr>
+            <w:rStyle w:val="Hyperlink"/>
+          </w:rPr>
+          <w:t>https://drive.google.com/drive/folders/1CCth64BM-Tv0-_fOGfWR-2PavQkoa1MS?usp=sharing</w:t>
+        </w:r>
+      </w:hyperlink>
+    </w:p>
     <w:p/>
     <w:p/>
     <w:p/>
@@ -3599,17 +3617,7 @@
                 <w:color w:val="auto"/>
                 <w:lang w:val="es-ES" w:eastAsia="es-CL"/>
               </w:rPr>
-              <w:t>18:3</w:t>
-            </w:r>
-            <w:r>
-              <w:rPr>
-                <w:rFonts w:eastAsia="Times New Roman" w:cs="Arial"/>
-                <w:b/>
-                <w:bCs/>
-                <w:color w:val="auto"/>
-                <w:lang w:val="es-ES" w:eastAsia="es-CL"/>
-              </w:rPr>
-              <w:t>7</w:t>
+              <w:t>18:37</w:t>
             </w:r>
           </w:p>
         </w:tc>
@@ -3996,15 +4004,7 @@
                 <w:color w:val="1F497D"/>
                 <w:lang w:val="es-ES" w:eastAsia="es-CL"/>
               </w:rPr>
-              <w:t>Prueba funcional</w:t>
-            </w:r>
-            <w:r>
-              <w:rPr>
-                <w:rFonts w:eastAsia="Times New Roman" w:cs="Arial"/>
-                <w:color w:val="1F497D"/>
-                <w:lang w:val="es-ES" w:eastAsia="es-CL"/>
-              </w:rPr>
-              <w:t xml:space="preserve"> de inicio de </w:t>
+              <w:t xml:space="preserve">Prueba funcional de inicio de </w:t>
             </w:r>
             <w:proofErr w:type="spellStart"/>
             <w:r>
@@ -4609,15 +4609,7 @@
                 <w:color w:val="1F497D"/>
                 <w:lang w:val="es-ES" w:eastAsia="es-CL"/>
               </w:rPr>
-              <w:t xml:space="preserve">Pulsar botón </w:t>
-            </w:r>
-            <w:r>
-              <w:rPr>
-                <w:rFonts w:eastAsia="Times New Roman" w:cs="Arial"/>
-                <w:color w:val="1F497D"/>
-                <w:lang w:val="es-ES" w:eastAsia="es-CL"/>
-              </w:rPr>
-              <w:t xml:space="preserve">Iniciar </w:t>
+              <w:t xml:space="preserve">Pulsar botón Iniciar </w:t>
             </w:r>
             <w:proofErr w:type="spellStart"/>
             <w:r>
@@ -4799,27 +4791,7 @@
                 <w:color w:val="auto"/>
                 <w:lang w:eastAsia="es-CL"/>
               </w:rPr>
-              <w:t xml:space="preserve">Debe ingresar </w:t>
-            </w:r>
-            <w:r>
-              <w:rPr>
-                <w:rFonts w:eastAsia="Times New Roman" w:cs="Arial"/>
-                <w:b/>
-                <w:bCs/>
-                <w:color w:val="auto"/>
-                <w:lang w:eastAsia="es-CL"/>
-              </w:rPr>
-              <w:t>nombre de usuario y contraseña del usuario correspondiente indicado en el formulario de registro</w:t>
-            </w:r>
-            <w:r>
-              <w:rPr>
-                <w:rFonts w:eastAsia="Times New Roman" w:cs="Arial"/>
-                <w:b/>
-                <w:bCs/>
-                <w:color w:val="auto"/>
-                <w:lang w:eastAsia="es-CL"/>
-              </w:rPr>
-              <w:t xml:space="preserve"> </w:t>
+              <w:t xml:space="preserve">Debe ingresar nombre de usuario y contraseña del usuario correspondiente indicado en el formulario de registro </w:t>
             </w:r>
           </w:p>
         </w:tc>
@@ -5515,17 +5487,7 @@
                 <w:color w:val="auto"/>
                 <w:lang w:val="es-ES" w:eastAsia="es-CL"/>
               </w:rPr>
-              <w:t>18:</w:t>
-            </w:r>
-            <w:r>
-              <w:rPr>
-                <w:rFonts w:eastAsia="Times New Roman" w:cs="Arial"/>
-                <w:b/>
-                <w:bCs/>
-                <w:color w:val="auto"/>
-                <w:lang w:val="es-ES" w:eastAsia="es-CL"/>
-              </w:rPr>
-              <w:t>40</w:t>
+              <w:t>18:40</w:t>
             </w:r>
           </w:p>
         </w:tc>
@@ -5924,15 +5886,7 @@
                 <w:color w:val="1F497D"/>
                 <w:lang w:val="es-ES" w:eastAsia="es-CL"/>
               </w:rPr>
-              <w:t xml:space="preserve">Prueba funcional </w:t>
-            </w:r>
-            <w:r>
-              <w:rPr>
-                <w:rFonts w:eastAsia="Times New Roman" w:cs="Arial"/>
-                <w:color w:val="1F497D"/>
-                <w:lang w:val="es-ES" w:eastAsia="es-CL"/>
-              </w:rPr>
-              <w:t>del despliegue de los datos del usuario conectado</w:t>
+              <w:t>Prueba funcional del despliegue de los datos del usuario conectado</w:t>
             </w:r>
           </w:p>
         </w:tc>
@@ -7797,17 +7751,7 @@
                 <w:color w:val="auto"/>
                 <w:lang w:eastAsia="es-CL"/>
               </w:rPr>
-              <w:t>1</w:t>
-            </w:r>
-            <w:r>
-              <w:rPr>
-                <w:rFonts w:eastAsia="Times New Roman" w:cs="Arial"/>
-                <w:b/>
-                <w:bCs/>
-                <w:color w:val="auto"/>
-                <w:lang w:eastAsia="es-CL"/>
-              </w:rPr>
-              <w:t>0 segundos</w:t>
+              <w:t>10 segundos</w:t>
             </w:r>
           </w:p>
         </w:tc>
@@ -8046,15 +7990,7 @@
                 <w:color w:val="1F497D"/>
                 <w:lang w:val="es-ES" w:eastAsia="es-CL"/>
               </w:rPr>
-              <w:t xml:space="preserve">Pulsar botón </w:t>
-            </w:r>
-            <w:r>
-              <w:rPr>
-                <w:rFonts w:eastAsia="Times New Roman" w:cs="Arial"/>
-                <w:color w:val="1F497D"/>
-                <w:lang w:val="es-ES" w:eastAsia="es-CL"/>
-              </w:rPr>
-              <w:t>Salir</w:t>
+              <w:t>Pulsar botón Salir</w:t>
             </w:r>
           </w:p>
         </w:tc>
@@ -8226,17 +8162,7 @@
                 <w:color w:val="auto"/>
                 <w:lang w:eastAsia="es-CL"/>
               </w:rPr>
-              <w:t>Al pulsar este botón, será redirigido al formulario de inicio de sesión.</w:t>
-            </w:r>
-            <w:r>
-              <w:rPr>
-                <w:rFonts w:eastAsia="Times New Roman" w:cs="Arial"/>
-                <w:b/>
-                <w:bCs/>
-                <w:color w:val="auto"/>
-                <w:lang w:eastAsia="es-CL"/>
-              </w:rPr>
-              <w:t xml:space="preserve"> </w:t>
+              <w:t xml:space="preserve">Al pulsar este botón, será redirigido al formulario de inicio de sesión. </w:t>
             </w:r>
           </w:p>
         </w:tc>
@@ -12017,17 +11943,7 @@
                 <w:color w:val="auto"/>
                 <w:lang w:val="es-ES" w:eastAsia="es-CL"/>
               </w:rPr>
-              <w:t xml:space="preserve">Paso </w:t>
-            </w:r>
-            <w:r>
-              <w:rPr>
-                <w:rFonts w:eastAsia="Times New Roman" w:cs="Arial"/>
-                <w:b/>
-                <w:bCs/>
-                <w:color w:val="auto"/>
-                <w:lang w:val="es-ES" w:eastAsia="es-CL"/>
-              </w:rPr>
-              <w:t>6</w:t>
+              <w:t>Paso 6</w:t>
             </w:r>
           </w:p>
         </w:tc>
@@ -12973,17 +12889,7 @@
                 <w:color w:val="auto"/>
                 <w:lang w:val="es-ES" w:eastAsia="es-CL"/>
               </w:rPr>
-              <w:t>18:</w:t>
-            </w:r>
-            <w:r>
-              <w:rPr>
-                <w:rFonts w:eastAsia="Times New Roman" w:cs="Arial"/>
-                <w:b/>
-                <w:bCs/>
-                <w:color w:val="auto"/>
-                <w:lang w:val="es-ES" w:eastAsia="es-CL"/>
-              </w:rPr>
-              <w:t>52</w:t>
+              <w:t>18:52</w:t>
             </w:r>
           </w:p>
         </w:tc>
@@ -14231,8 +14137,8 @@
     <w:p>
       <w:pPr>
         <w:sectPr>
-          <w:headerReference w:type="default" r:id="rId19"/>
-          <w:footerReference w:type="default" r:id="rId20"/>
+          <w:headerReference w:type="default" r:id="rId20"/>
+          <w:footerReference w:type="default" r:id="rId21"/>
           <w:type w:val="continuous"/>
           <w:pgSz w:w="12240" w:h="15840"/>
           <w:pgMar w:top="1440" w:right="1080" w:bottom="1440" w:left="1080" w:header="708" w:footer="708" w:gutter="0"/>
@@ -14284,7 +14190,7 @@
                     <pic:cNvPicPr/>
                   </pic:nvPicPr>
                   <pic:blipFill>
-                    <a:blip r:embed="rId21">
+                    <a:blip r:embed="rId22">
                       <a:extLst>
                         <a:ext uri="{28A0092B-C50C-407E-A947-70E740481C1C}">
                           <a14:useLocalDpi xmlns:a14="http://schemas.microsoft.com/office/drawing/2010/main" val="0"/>
@@ -14333,7 +14239,7 @@
           <w:noProof/>
         </w:rPr>
         <w:drawing>
-          <wp:anchor distT="0" distB="0" distL="114300" distR="114300" simplePos="0" relativeHeight="251683840" behindDoc="0" locked="0" layoutInCell="1" allowOverlap="1" wp14:anchorId="64AEDEE1" wp14:editId="714D308F">
+          <wp:anchor distT="0" distB="0" distL="114300" distR="114300" simplePos="0" relativeHeight="251683840" behindDoc="0" locked="0" layoutInCell="1" allowOverlap="1" wp14:anchorId="64AEDEE1" wp14:editId="36BE22D4">
             <wp:simplePos x="0" y="0"/>
             <wp:positionH relativeFrom="margin">
               <wp:posOffset>1704975</wp:posOffset>
@@ -14356,7 +14262,7 @@
                     <pic:cNvPicPr/>
                   </pic:nvPicPr>
                   <pic:blipFill>
-                    <a:blip r:embed="rId22" cstate="print">
+                    <a:blip r:embed="rId23" cstate="print">
                       <a:extLst>
                         <a:ext uri="{28A0092B-C50C-407E-A947-70E740481C1C}">
                           <a14:useLocalDpi xmlns:a14="http://schemas.microsoft.com/office/drawing/2010/main" val="0"/>
@@ -14417,8 +14323,8 @@
       </w:r>
     </w:p>
     <w:sectPr>
-      <w:headerReference w:type="default" r:id="rId23"/>
-      <w:footerReference w:type="default" r:id="rId24"/>
+      <w:headerReference w:type="default" r:id="rId24"/>
+      <w:footerReference w:type="default" r:id="rId25"/>
       <w:pgSz w:w="12240" w:h="15840"/>
       <w:pgMar w:top="1440" w:right="1080" w:bottom="1440" w:left="1080" w:header="708" w:footer="708" w:gutter="0"/>
       <w:pgNumType w:start="1"/>
@@ -14645,7 +14551,7 @@
                 </wp:anchor>
               </w:drawing>
             </mc:Choice>
-            <mc:Fallback xmlns:a="http://schemas.openxmlformats.org/drawingml/2006/main" xmlns:adec="http://schemas.microsoft.com/office/drawing/2017/decorative">
+            <mc:Fallback xmlns:adec="http://schemas.microsoft.com/office/drawing/2017/decorative" xmlns:a="http://schemas.openxmlformats.org/drawingml/2006/main">
               <w:pict>
                 <v:line id="Conector recto 6" style="position:absolute;z-index:251668480;visibility:visible;mso-wrap-style:square;mso-wrap-distance-left:9pt;mso-wrap-distance-top:0;mso-wrap-distance-right:9pt;mso-wrap-distance-bottom:0;mso-position-horizontal:absolute;mso-position-horizontal-relative:text;mso-position-vertical:absolute;mso-position-vertical-relative:text" o:spid="_x0000_s1026" strokecolor="#cfcdcd [2894]" strokeweight="2.25pt" from="491.35pt,-4.3pt" to="508.75pt,-4.3pt" w14:anchorId="0FD54B39" o:gfxdata="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">
                   <v:stroke joinstyle="miter"/>
@@ -14715,7 +14621,7 @@
                 </wp:anchor>
               </w:drawing>
             </mc:Choice>
-            <mc:Fallback xmlns:a="http://schemas.openxmlformats.org/drawingml/2006/main" xmlns:adec="http://schemas.microsoft.com/office/drawing/2017/decorative">
+            <mc:Fallback xmlns:adec="http://schemas.microsoft.com/office/drawing/2017/decorative" xmlns:a="http://schemas.openxmlformats.org/drawingml/2006/main">
               <w:pict>
                 <v:line id="Conector recto 5" style="position:absolute;z-index:251667456;visibility:visible;mso-wrap-style:square;mso-wrap-distance-left:9pt;mso-wrap-distance-top:0;mso-wrap-distance-right:9pt;mso-wrap-distance-bottom:0;mso-position-horizontal:absolute;mso-position-horizontal-relative:text;mso-position-vertical:absolute;mso-position-vertical-relative:text" o:spid="_x0000_s1026" strokecolor="#aeaaaa [2414]" strokeweight="2.25pt" from="-4.75pt,-5.8pt" to="50.95pt,-5.8pt" w14:anchorId="77485C56" o:gfxdata="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">
                   <v:stroke joinstyle="miter"/>
@@ -15176,7 +15082,7 @@
             </wp:anchor>
           </w:drawing>
         </mc:Choice>
-        <mc:Fallback xmlns:a14="http://schemas.microsoft.com/office/drawing/2010/main" xmlns:pic="http://schemas.openxmlformats.org/drawingml/2006/picture" xmlns:adec="http://schemas.microsoft.com/office/drawing/2017/decorative" xmlns:a="http://schemas.openxmlformats.org/drawingml/2006/main">
+        <mc:Fallback xmlns:a="http://schemas.openxmlformats.org/drawingml/2006/main" xmlns:adec="http://schemas.microsoft.com/office/drawing/2017/decorative" xmlns:pic="http://schemas.openxmlformats.org/drawingml/2006/picture" xmlns:a14="http://schemas.microsoft.com/office/drawing/2010/main">
           <w:pict>
             <v:rect id="Rectángulo 3" style="position:absolute;margin-left:.75pt;margin-top:-34.7pt;width:610.5pt;height:54pt;z-index:-251650048;visibility:visible;mso-wrap-style:square;mso-wrap-distance-left:9pt;mso-wrap-distance-top:0;mso-wrap-distance-right:9pt;mso-wrap-distance-bottom:0;mso-position-horizontal:absolute;mso-position-horizontal-relative:page;mso-position-vertical:absolute;mso-position-vertical-relative:text;v-text-anchor:middle" alt="&quot;&quot;" o:spid="_x0000_s1026" fillcolor="#f0f0f0" stroked="f" strokeweight="1pt" w14:anchorId="19E80F0F" o:gfxdata="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">
               <w10:wrap anchorx="page"/>
@@ -16133,6 +16039,7 @@
   <w:style w:type="character" w:default="1" w:styleId="DefaultParagraphFont">
     <w:name w:val="Default Paragraph Font"/>
     <w:uiPriority w:val="1"/>
+    <w:semiHidden/>
     <w:unhideWhenUsed/>
   </w:style>
   <w:style w:type="table" w:default="1" w:styleId="TableNormal">
@@ -18439,27 +18346,6 @@
 </file>
 
 <file path=customXml/item1.xml><?xml version="1.0" encoding="utf-8"?>
-<p:properties xmlns:p="http://schemas.microsoft.com/office/2006/metadata/properties" xmlns:xsi="http://www.w3.org/2001/XMLSchema-instance" xmlns:pc="http://schemas.microsoft.com/office/infopath/2007/PartnerControls">
-  <documentManagement>
-    <TaxCatchAll xmlns="edc1eb1c-f9b5-429a-a0ce-702847a0aa2d" xsi:nil="true"/>
-    <lcf76f155ced4ddcb4097134ff3c332f xmlns="d0daa353-f819-43d1-badf-ce69fea8800d">
-      <Terms xmlns="http://schemas.microsoft.com/office/infopath/2007/PartnerControls"/>
-    </lcf76f155ced4ddcb4097134ff3c332f>
-    <Fecha_x0020_de_x0020_creaci_x00f3_n xmlns="d0daa353-f819-43d1-badf-ce69fea8800d" xsi:nil="true"/>
-    <Fechayhora xmlns="d0daa353-f819-43d1-badf-ce69fea8800d" xsi:nil="true"/>
-    <SharedWithUsers xmlns="edc1eb1c-f9b5-429a-a0ce-702847a0aa2d">
-      <UserInfo>
-        <DisplayName/>
-        <AccountId xsi:nil="true"/>
-        <AccountType/>
-      </UserInfo>
-    </SharedWithUsers>
-    <MediaLengthInSeconds xmlns="d0daa353-f819-43d1-badf-ce69fea8800d" xsi:nil="true"/>
-  </documentManagement>
-</p:properties>
-</file>
-
-<file path=customXml/item2.xml><?xml version="1.0" encoding="utf-8"?>
 <ct:contentTypeSchema xmlns:ct="http://schemas.microsoft.com/office/2006/metadata/contentType" xmlns:ma="http://schemas.microsoft.com/office/2006/metadata/properties/metaAttributes" ct:_="" ma:_="" ma:contentTypeName="Documento" ma:contentTypeID="0x01010070BFDEA41A5D8B46AA5DA2E2389CBE4E" ma:contentTypeVersion="18" ma:contentTypeDescription="Crear nuevo documento." ma:contentTypeScope="" ma:versionID="672700c7c1e39a78a362f54b21ce1efa">
   <xsd:schema xmlns:xsd="http://www.w3.org/2001/XMLSchema" xmlns:xs="http://www.w3.org/2001/XMLSchema" xmlns:p="http://schemas.microsoft.com/office/2006/metadata/properties" xmlns:ns2="d0daa353-f819-43d1-badf-ce69fea8800d" xmlns:ns3="edc1eb1c-f9b5-429a-a0ce-702847a0aa2d" targetNamespace="http://schemas.microsoft.com/office/2006/metadata/properties" ma:root="true" ma:fieldsID="3db37e5c6f54565a9911855e2c96e577" ns2:_="" ns3:_="">
     <xsd:import namespace="d0daa353-f819-43d1-badf-ce69fea8800d"/>
@@ -18714,7 +18600,32 @@
 </ct:contentTypeSchema>
 </file>
 
+<file path=customXml/item2.xml><?xml version="1.0" encoding="utf-8"?>
+<p:properties xmlns:p="http://schemas.microsoft.com/office/2006/metadata/properties" xmlns:xsi="http://www.w3.org/2001/XMLSchema-instance" xmlns:pc="http://schemas.microsoft.com/office/infopath/2007/PartnerControls">
+  <documentManagement>
+    <TaxCatchAll xmlns="edc1eb1c-f9b5-429a-a0ce-702847a0aa2d" xsi:nil="true"/>
+    <lcf76f155ced4ddcb4097134ff3c332f xmlns="d0daa353-f819-43d1-badf-ce69fea8800d">
+      <Terms xmlns="http://schemas.microsoft.com/office/infopath/2007/PartnerControls"/>
+    </lcf76f155ced4ddcb4097134ff3c332f>
+    <Fecha_x0020_de_x0020_creaci_x00f3_n xmlns="d0daa353-f819-43d1-badf-ce69fea8800d" xsi:nil="true"/>
+    <Fechayhora xmlns="d0daa353-f819-43d1-badf-ce69fea8800d" xsi:nil="true"/>
+    <SharedWithUsers xmlns="edc1eb1c-f9b5-429a-a0ce-702847a0aa2d">
+      <UserInfo>
+        <DisplayName/>
+        <AccountId xsi:nil="true"/>
+        <AccountType/>
+      </UserInfo>
+    </SharedWithUsers>
+    <MediaLengthInSeconds xmlns="d0daa353-f819-43d1-badf-ce69fea8800d" xsi:nil="true"/>
+  </documentManagement>
+</p:properties>
+</file>
+
 <file path=customXml/item3.xml><?xml version="1.0" encoding="utf-8"?>
+<b:Sources xmlns:b="http://schemas.openxmlformats.org/officeDocument/2006/bibliography" xmlns="http://schemas.openxmlformats.org/officeDocument/2006/bibliography" SelectedStyle="\APASixthEditionOfficeOnline.xsl" StyleName="APA" Version="6"/>
+</file>
+
+<file path=customXml/item4.xml><?xml version="1.0" encoding="utf-8"?>
 <?mso-contentType ?>
 <FormTemplates xmlns="http://schemas.microsoft.com/sharepoint/v3/contenttype/forms">
   <Display>DocumentLibraryForm</Display>
@@ -18723,22 +18634,7 @@
 </FormTemplates>
 </file>
 
-<file path=customXml/item4.xml><?xml version="1.0" encoding="utf-8"?>
-<b:Sources xmlns:b="http://schemas.openxmlformats.org/officeDocument/2006/bibliography" xmlns="http://schemas.openxmlformats.org/officeDocument/2006/bibliography" SelectedStyle="\APASixthEditionOfficeOnline.xsl" StyleName="APA" Version="6"/>
-</file>
-
 <file path=customXml/itemProps1.xml><?xml version="1.0" encoding="utf-8"?>
-<ds:datastoreItem xmlns:ds="http://schemas.openxmlformats.org/officeDocument/2006/customXml" ds:itemID="{D60E2242-C2E1-4E23-9065-10C7EC1F40B5}">
-  <ds:schemaRefs>
-    <ds:schemaRef ds:uri="http://schemas.microsoft.com/office/2006/metadata/properties"/>
-    <ds:schemaRef ds:uri="http://schemas.microsoft.com/office/infopath/2007/PartnerControls"/>
-    <ds:schemaRef ds:uri="edc1eb1c-f9b5-429a-a0ce-702847a0aa2d"/>
-    <ds:schemaRef ds:uri="d0daa353-f819-43d1-badf-ce69fea8800d"/>
-  </ds:schemaRefs>
-</ds:datastoreItem>
-</file>
-
-<file path=customXml/itemProps2.xml><?xml version="1.0" encoding="utf-8"?>
 <ds:datastoreItem xmlns:ds="http://schemas.openxmlformats.org/officeDocument/2006/customXml" ds:itemID="{1BD347B7-80A8-463F-9863-65CB61887422}">
   <ds:schemaRefs>
     <ds:schemaRef ds:uri="http://schemas.microsoft.com/office/2006/metadata/contentType"/>
@@ -18757,18 +18653,29 @@
 </ds:datastoreItem>
 </file>
 
+<file path=customXml/itemProps2.xml><?xml version="1.0" encoding="utf-8"?>
+<ds:datastoreItem xmlns:ds="http://schemas.openxmlformats.org/officeDocument/2006/customXml" ds:itemID="{D60E2242-C2E1-4E23-9065-10C7EC1F40B5}">
+  <ds:schemaRefs>
+    <ds:schemaRef ds:uri="http://schemas.microsoft.com/office/2006/metadata/properties"/>
+    <ds:schemaRef ds:uri="http://schemas.microsoft.com/office/infopath/2007/PartnerControls"/>
+    <ds:schemaRef ds:uri="edc1eb1c-f9b5-429a-a0ce-702847a0aa2d"/>
+    <ds:schemaRef ds:uri="d0daa353-f819-43d1-badf-ce69fea8800d"/>
+  </ds:schemaRefs>
+</ds:datastoreItem>
+</file>
+
 <file path=customXml/itemProps3.xml><?xml version="1.0" encoding="utf-8"?>
+<ds:datastoreItem xmlns:ds="http://schemas.openxmlformats.org/officeDocument/2006/customXml" ds:itemID="{C67705AF-782E-49C6-96DD-5A5A2AE07537}">
+  <ds:schemaRefs>
+    <ds:schemaRef ds:uri="http://schemas.openxmlformats.org/officeDocument/2006/bibliography"/>
+  </ds:schemaRefs>
+</ds:datastoreItem>
+</file>
+
+<file path=customXml/itemProps4.xml><?xml version="1.0" encoding="utf-8"?>
 <ds:datastoreItem xmlns:ds="http://schemas.openxmlformats.org/officeDocument/2006/customXml" ds:itemID="{0AB0234B-24F9-4BE2-95EF-A26C37CFD935}">
   <ds:schemaRefs>
     <ds:schemaRef ds:uri="http://schemas.microsoft.com/sharepoint/v3/contenttype/forms"/>
   </ds:schemaRefs>
 </ds:datastoreItem>
-</file>
-
-<file path=customXml/itemProps4.xml><?xml version="1.0" encoding="utf-8"?>
-<ds:datastoreItem xmlns:ds="http://schemas.openxmlformats.org/officeDocument/2006/customXml" ds:itemID="{C67705AF-782E-49C6-96DD-5A5A2AE07537}">
-  <ds:schemaRefs>
-    <ds:schemaRef ds:uri="http://schemas.openxmlformats.org/officeDocument/2006/bibliography"/>
-  </ds:schemaRefs>
-</ds:datastoreItem>
 </file>
</xml_diff>